<commit_message>
feat: add Prometheus metrics for HTTP requests and database connections; update Dockerfile and environment configurations
</commit_message>
<xml_diff>
--- a/Timesheet_Management_User_Guide.docx
+++ b/Timesheet_Management_User_Guide.docx
@@ -83,7 +83,15 @@
     <w:p/>
     <w:p>
       <w:r>
-        <w:t>Version 2.0  -  July 2026</w:t>
+        <w:t xml:space="preserve">Version </w:t>
+      </w:r>
+      <w:proofErr w:type="gramStart"/>
+      <w:r>
+        <w:t>2.0  -</w:t>
+      </w:r>
+      <w:proofErr w:type="gramEnd"/>
+      <w:r>
+        <w:t xml:space="preserve">  July 2026</w:t>
       </w:r>
     </w:p>
     <w:p>
@@ -121,8 +129,13 @@
         <w:pStyle w:val="Heading2"/>
       </w:pPr>
       <w:r>
-        <w:t>1.1 Roles at a Glance</w:t>
-      </w:r>
+        <w:t xml:space="preserve">1.1 Roles </w:t>
+      </w:r>
+      <w:proofErr w:type="gramStart"/>
+      <w:r>
+        <w:t>at a Glance</w:t>
+      </w:r>
+      <w:proofErr w:type="gramEnd"/>
     </w:p>
     <w:tbl>
       <w:tblPr>
@@ -144,12 +157,6 @@
         <w:gridCol w:w="3009"/>
       </w:tblGrid>
       <w:tr>
-        <w:tblPrEx>
-          <w:tblCellMar>
-            <w:top w:w="0" w:type="dxa"/>
-            <w:bottom w:w="0" w:type="dxa"/>
-          </w:tblCellMar>
-        </w:tblPrEx>
         <w:tc>
           <w:tcPr>
             <w:tcW w:w="3008" w:type="dxa"/>
@@ -206,12 +213,6 @@
         </w:tc>
       </w:tr>
       <w:tr>
-        <w:tblPrEx>
-          <w:tblCellMar>
-            <w:top w:w="0" w:type="dxa"/>
-            <w:bottom w:w="0" w:type="dxa"/>
-          </w:tblCellMar>
-        </w:tblPrEx>
         <w:tc>
           <w:tcPr>
             <w:tcW w:w="3008" w:type="dxa"/>
@@ -244,12 +245,6 @@
         </w:tc>
       </w:tr>
       <w:tr>
-        <w:tblPrEx>
-          <w:tblCellMar>
-            <w:top w:w="0" w:type="dxa"/>
-            <w:bottom w:w="0" w:type="dxa"/>
-          </w:tblCellMar>
-        </w:tblPrEx>
         <w:tc>
           <w:tcPr>
             <w:tcW w:w="3008" w:type="dxa"/>
@@ -282,12 +277,6 @@
         </w:tc>
       </w:tr>
       <w:tr>
-        <w:tblPrEx>
-          <w:tblCellMar>
-            <w:top w:w="0" w:type="dxa"/>
-            <w:bottom w:w="0" w:type="dxa"/>
-          </w:tblCellMar>
-        </w:tblPrEx>
         <w:tc>
           <w:tcPr>
             <w:tcW w:w="3008" w:type="dxa"/>
@@ -320,12 +309,6 @@
         </w:tc>
       </w:tr>
       <w:tr>
-        <w:tblPrEx>
-          <w:tblCellMar>
-            <w:top w:w="0" w:type="dxa"/>
-            <w:bottom w:w="0" w:type="dxa"/>
-          </w:tblCellMar>
-        </w:tblPrEx>
         <w:tc>
           <w:tcPr>
             <w:tcW w:w="3008" w:type="dxa"/>
@@ -358,12 +341,6 @@
         </w:tc>
       </w:tr>
       <w:tr>
-        <w:tblPrEx>
-          <w:tblCellMar>
-            <w:top w:w="0" w:type="dxa"/>
-            <w:bottom w:w="0" w:type="dxa"/>
-          </w:tblCellMar>
-        </w:tblPrEx>
         <w:tc>
           <w:tcPr>
             <w:tcW w:w="3008" w:type="dxa"/>
@@ -396,12 +373,6 @@
         </w:tc>
       </w:tr>
       <w:tr>
-        <w:tblPrEx>
-          <w:tblCellMar>
-            <w:top w:w="0" w:type="dxa"/>
-            <w:bottom w:w="0" w:type="dxa"/>
-          </w:tblCellMar>
-        </w:tblPrEx>
         <w:tc>
           <w:tcPr>
             <w:tcW w:w="3008" w:type="dxa"/>
@@ -434,12 +405,6 @@
         </w:tc>
       </w:tr>
       <w:tr>
-        <w:tblPrEx>
-          <w:tblCellMar>
-            <w:top w:w="0" w:type="dxa"/>
-            <w:bottom w:w="0" w:type="dxa"/>
-          </w:tblCellMar>
-        </w:tblPrEx>
         <w:tc>
           <w:tcPr>
             <w:tcW w:w="3008" w:type="dxa"/>
@@ -635,12 +600,6 @@
         <w:gridCol w:w="4513"/>
       </w:tblGrid>
       <w:tr>
-        <w:tblPrEx>
-          <w:tblCellMar>
-            <w:top w:w="0" w:type="dxa"/>
-            <w:bottom w:w="0" w:type="dxa"/>
-          </w:tblCellMar>
-        </w:tblPrEx>
         <w:tc>
           <w:tcPr>
             <w:tcW w:w="4513" w:type="dxa"/>
@@ -679,12 +638,6 @@
         </w:tc>
       </w:tr>
       <w:tr>
-        <w:tblPrEx>
-          <w:tblCellMar>
-            <w:top w:w="0" w:type="dxa"/>
-            <w:bottom w:w="0" w:type="dxa"/>
-          </w:tblCellMar>
-        </w:tblPrEx>
         <w:tc>
           <w:tcPr>
             <w:tcW w:w="4513" w:type="dxa"/>
@@ -708,12 +661,6 @@
         </w:tc>
       </w:tr>
       <w:tr>
-        <w:tblPrEx>
-          <w:tblCellMar>
-            <w:top w:w="0" w:type="dxa"/>
-            <w:bottom w:w="0" w:type="dxa"/>
-          </w:tblCellMar>
-        </w:tblPrEx>
         <w:tc>
           <w:tcPr>
             <w:tcW w:w="4513" w:type="dxa"/>
@@ -736,12 +683,6 @@
         </w:tc>
       </w:tr>
       <w:tr>
-        <w:tblPrEx>
-          <w:tblCellMar>
-            <w:top w:w="0" w:type="dxa"/>
-            <w:bottom w:w="0" w:type="dxa"/>
-          </w:tblCellMar>
-        </w:tblPrEx>
         <w:tc>
           <w:tcPr>
             <w:tcW w:w="4513" w:type="dxa"/>
@@ -764,12 +705,6 @@
         </w:tc>
       </w:tr>
       <w:tr>
-        <w:tblPrEx>
-          <w:tblCellMar>
-            <w:top w:w="0" w:type="dxa"/>
-            <w:bottom w:w="0" w:type="dxa"/>
-          </w:tblCellMar>
-        </w:tblPrEx>
         <w:tc>
           <w:tcPr>
             <w:tcW w:w="4513" w:type="dxa"/>
@@ -792,12 +727,6 @@
         </w:tc>
       </w:tr>
       <w:tr>
-        <w:tblPrEx>
-          <w:tblCellMar>
-            <w:top w:w="0" w:type="dxa"/>
-            <w:bottom w:w="0" w:type="dxa"/>
-          </w:tblCellMar>
-        </w:tblPrEx>
         <w:tc>
           <w:tcPr>
             <w:tcW w:w="4513" w:type="dxa"/>
@@ -820,12 +749,6 @@
         </w:tc>
       </w:tr>
       <w:tr>
-        <w:tblPrEx>
-          <w:tblCellMar>
-            <w:top w:w="0" w:type="dxa"/>
-            <w:bottom w:w="0" w:type="dxa"/>
-          </w:tblCellMar>
-        </w:tblPrEx>
         <w:tc>
           <w:tcPr>
             <w:tcW w:w="4513" w:type="dxa"/>
@@ -1068,12 +991,6 @@
         <w:gridCol w:w="3009"/>
       </w:tblGrid>
       <w:tr>
-        <w:tblPrEx>
-          <w:tblCellMar>
-            <w:top w:w="0" w:type="dxa"/>
-            <w:bottom w:w="0" w:type="dxa"/>
-          </w:tblCellMar>
-        </w:tblPrEx>
         <w:tc>
           <w:tcPr>
             <w:tcW w:w="3008" w:type="dxa"/>
@@ -1130,12 +1047,6 @@
         </w:tc>
       </w:tr>
       <w:tr>
-        <w:tblPrEx>
-          <w:tblCellMar>
-            <w:top w:w="0" w:type="dxa"/>
-            <w:bottom w:w="0" w:type="dxa"/>
-          </w:tblCellMar>
-        </w:tblPrEx>
         <w:tc>
           <w:tcPr>
             <w:tcW w:w="3008" w:type="dxa"/>
@@ -1168,12 +1079,6 @@
         </w:tc>
       </w:tr>
       <w:tr>
-        <w:tblPrEx>
-          <w:tblCellMar>
-            <w:top w:w="0" w:type="dxa"/>
-            <w:bottom w:w="0" w:type="dxa"/>
-          </w:tblCellMar>
-        </w:tblPrEx>
         <w:tc>
           <w:tcPr>
             <w:tcW w:w="3008" w:type="dxa"/>
@@ -1200,18 +1105,20 @@
           </w:tcPr>
           <w:p>
             <w:r>
-              <w:t>View only, or Withdraw to recall it</w:t>
-            </w:r>
-          </w:p>
-        </w:tc>
-      </w:tr>
-      <w:tr>
-        <w:tblPrEx>
-          <w:tblCellMar>
-            <w:top w:w="0" w:type="dxa"/>
-            <w:bottom w:w="0" w:type="dxa"/>
-          </w:tblCellMar>
-        </w:tblPrEx>
+              <w:t xml:space="preserve">View only, or </w:t>
+            </w:r>
+            <w:proofErr w:type="gramStart"/>
+            <w:r>
+              <w:t>Withdraw</w:t>
+            </w:r>
+            <w:proofErr w:type="gramEnd"/>
+            <w:r>
+              <w:t xml:space="preserve"> to recall it</w:t>
+            </w:r>
+          </w:p>
+        </w:tc>
+      </w:tr>
+      <w:tr>
         <w:tc>
           <w:tcPr>
             <w:tcW w:w="3008" w:type="dxa"/>
@@ -1244,12 +1151,6 @@
         </w:tc>
       </w:tr>
       <w:tr>
-        <w:tblPrEx>
-          <w:tblCellMar>
-            <w:top w:w="0" w:type="dxa"/>
-            <w:bottom w:w="0" w:type="dxa"/>
-          </w:tblCellMar>
-        </w:tblPrEx>
         <w:tc>
           <w:tcPr>
             <w:tcW w:w="3008" w:type="dxa"/>
@@ -1282,12 +1183,6 @@
         </w:tc>
       </w:tr>
       <w:tr>
-        <w:tblPrEx>
-          <w:tblCellMar>
-            <w:top w:w="0" w:type="dxa"/>
-            <w:bottom w:w="0" w:type="dxa"/>
-          </w:tblCellMar>
-        </w:tblPrEx>
         <w:tc>
           <w:tcPr>
             <w:tcW w:w="3008" w:type="dxa"/>
@@ -1320,12 +1215,6 @@
         </w:tc>
       </w:tr>
       <w:tr>
-        <w:tblPrEx>
-          <w:tblCellMar>
-            <w:top w:w="0" w:type="dxa"/>
-            <w:bottom w:w="0" w:type="dxa"/>
-          </w:tblCellMar>
-        </w:tblPrEx>
         <w:tc>
           <w:tcPr>
             <w:tcW w:w="3008" w:type="dxa"/>
@@ -1561,12 +1450,6 @@
         <w:gridCol w:w="4513"/>
       </w:tblGrid>
       <w:tr>
-        <w:tblPrEx>
-          <w:tblCellMar>
-            <w:top w:w="0" w:type="dxa"/>
-            <w:bottom w:w="0" w:type="dxa"/>
-          </w:tblCellMar>
-        </w:tblPrEx>
         <w:tc>
           <w:tcPr>
             <w:tcW w:w="4513" w:type="dxa"/>
@@ -1605,12 +1488,6 @@
         </w:tc>
       </w:tr>
       <w:tr>
-        <w:tblPrEx>
-          <w:tblCellMar>
-            <w:top w:w="0" w:type="dxa"/>
-            <w:bottom w:w="0" w:type="dxa"/>
-          </w:tblCellMar>
-        </w:tblPrEx>
         <w:tc>
           <w:tcPr>
             <w:tcW w:w="4513" w:type="dxa"/>
@@ -1634,12 +1511,6 @@
         </w:tc>
       </w:tr>
       <w:tr>
-        <w:tblPrEx>
-          <w:tblCellMar>
-            <w:top w:w="0" w:type="dxa"/>
-            <w:bottom w:w="0" w:type="dxa"/>
-          </w:tblCellMar>
-        </w:tblPrEx>
         <w:tc>
           <w:tcPr>
             <w:tcW w:w="4513" w:type="dxa"/>
@@ -1662,12 +1533,6 @@
         </w:tc>
       </w:tr>
       <w:tr>
-        <w:tblPrEx>
-          <w:tblCellMar>
-            <w:top w:w="0" w:type="dxa"/>
-            <w:bottom w:w="0" w:type="dxa"/>
-          </w:tblCellMar>
-        </w:tblPrEx>
         <w:tc>
           <w:tcPr>
             <w:tcW w:w="4513" w:type="dxa"/>
@@ -1805,12 +1670,6 @@
         <w:gridCol w:w="4513"/>
       </w:tblGrid>
       <w:tr>
-        <w:tblPrEx>
-          <w:tblCellMar>
-            <w:top w:w="0" w:type="dxa"/>
-            <w:bottom w:w="0" w:type="dxa"/>
-          </w:tblCellMar>
-        </w:tblPrEx>
         <w:tc>
           <w:tcPr>
             <w:tcW w:w="4513" w:type="dxa"/>
@@ -1849,12 +1708,6 @@
         </w:tc>
       </w:tr>
       <w:tr>
-        <w:tblPrEx>
-          <w:tblCellMar>
-            <w:top w:w="0" w:type="dxa"/>
-            <w:bottom w:w="0" w:type="dxa"/>
-          </w:tblCellMar>
-        </w:tblPrEx>
         <w:tc>
           <w:tcPr>
             <w:tcW w:w="4513" w:type="dxa"/>
@@ -1877,12 +1730,6 @@
         </w:tc>
       </w:tr>
       <w:tr>
-        <w:tblPrEx>
-          <w:tblCellMar>
-            <w:top w:w="0" w:type="dxa"/>
-            <w:bottom w:w="0" w:type="dxa"/>
-          </w:tblCellMar>
-        </w:tblPrEx>
         <w:tc>
           <w:tcPr>
             <w:tcW w:w="4513" w:type="dxa"/>
@@ -1905,12 +1752,6 @@
         </w:tc>
       </w:tr>
       <w:tr>
-        <w:tblPrEx>
-          <w:tblCellMar>
-            <w:top w:w="0" w:type="dxa"/>
-            <w:bottom w:w="0" w:type="dxa"/>
-          </w:tblCellMar>
-        </w:tblPrEx>
         <w:tc>
           <w:tcPr>
             <w:tcW w:w="4513" w:type="dxa"/>
@@ -1933,12 +1774,6 @@
         </w:tc>
       </w:tr>
       <w:tr>
-        <w:tblPrEx>
-          <w:tblCellMar>
-            <w:top w:w="0" w:type="dxa"/>
-            <w:bottom w:w="0" w:type="dxa"/>
-          </w:tblCellMar>
-        </w:tblPrEx>
         <w:tc>
           <w:tcPr>
             <w:tcW w:w="4513" w:type="dxa"/>
@@ -1961,12 +1796,6 @@
         </w:tc>
       </w:tr>
       <w:tr>
-        <w:tblPrEx>
-          <w:tblCellMar>
-            <w:top w:w="0" w:type="dxa"/>
-            <w:bottom w:w="0" w:type="dxa"/>
-          </w:tblCellMar>
-        </w:tblPrEx>
         <w:tc>
           <w:tcPr>
             <w:tcW w:w="4513" w:type="dxa"/>
@@ -2088,7 +1917,15 @@
         <w:pStyle w:val="ListBullet"/>
       </w:pPr>
       <w:r>
-        <w:t>Edit your First Name, Last Name, Phone Number, and Timezone, then click Save.</w:t>
+        <w:t xml:space="preserve">Edit your First Name, Last Name, Phone Number, and </w:t>
+      </w:r>
+      <w:proofErr w:type="spellStart"/>
+      <w:r>
+        <w:t>Timezone</w:t>
+      </w:r>
+      <w:proofErr w:type="spellEnd"/>
+      <w:r>
+        <w:t>, then click Save.</w:t>
       </w:r>
     </w:p>
     <w:p>
@@ -2205,7 +2042,15 @@
     </w:p>
     <w:p>
       <w:r>
-        <w:t>Employees submit individual days, and you review each one. Each card shows the employee name, date, hours logged, and a breakdown of project/category entries.</w:t>
+        <w:t xml:space="preserve">Employees submit individual days, and you review each one. Each card shows the </w:t>
+      </w:r>
+      <w:proofErr w:type="gramStart"/>
+      <w:r>
+        <w:t>employee</w:t>
+      </w:r>
+      <w:proofErr w:type="gramEnd"/>
+      <w:r>
+        <w:t xml:space="preserve"> name, date, hours logged, and a breakdown of project/category entries.</w:t>
       </w:r>
     </w:p>
     <w:p>
@@ -2255,7 +2100,15 @@
     </w:p>
     <w:p>
       <w:r>
-        <w:t>Shows full-week timesheet submissions, used only if your organisation still relies on the older week-level submission workflow. Tick one or more rows and click Approve Selected, or click Reject on an individual row and enter a comment.</w:t>
+        <w:t xml:space="preserve">Shows full-week timesheet submissions, used only if your organisation still relies on the older week-level submission workflow. Tick one or more rows and click Approve </w:t>
+      </w:r>
+      <w:proofErr w:type="gramStart"/>
+      <w:r>
+        <w:t>Selected, or</w:t>
+      </w:r>
+      <w:proofErr w:type="gramEnd"/>
+      <w:r>
+        <w:t xml:space="preserve"> click Reject on an individual row and enter a comment.</w:t>
       </w:r>
     </w:p>
     <w:p>
@@ -2321,7 +2174,15 @@
     </w:p>
     <w:p>
       <w:r>
-        <w:t>The Projects list shows all projects with their status, client, and budget. Use the search bar to find a project by name or code, and click a project name to open its detail page.</w:t>
+        <w:t xml:space="preserve">The Projects list shows all projects with their status, client, and budget. Use the search bar to find a project by name or </w:t>
+      </w:r>
+      <w:proofErr w:type="gramStart"/>
+      <w:r>
+        <w:t>code, and</w:t>
+      </w:r>
+      <w:proofErr w:type="gramEnd"/>
+      <w:r>
+        <w:t xml:space="preserve"> click a project name to open its detail page.</w:t>
       </w:r>
     </w:p>
     <w:p>
@@ -2383,12 +2244,6 @@
         <w:gridCol w:w="4513"/>
       </w:tblGrid>
       <w:tr>
-        <w:tblPrEx>
-          <w:tblCellMar>
-            <w:top w:w="0" w:type="dxa"/>
-            <w:bottom w:w="0" w:type="dxa"/>
-          </w:tblCellMar>
-        </w:tblPrEx>
         <w:tc>
           <w:tcPr>
             <w:tcW w:w="4513" w:type="dxa"/>
@@ -2427,12 +2282,6 @@
         </w:tc>
       </w:tr>
       <w:tr>
-        <w:tblPrEx>
-          <w:tblCellMar>
-            <w:top w:w="0" w:type="dxa"/>
-            <w:bottom w:w="0" w:type="dxa"/>
-          </w:tblCellMar>
-        </w:tblPrEx>
         <w:tc>
           <w:tcPr>
             <w:tcW w:w="4513" w:type="dxa"/>
@@ -2455,12 +2304,6 @@
         </w:tc>
       </w:tr>
       <w:tr>
-        <w:tblPrEx>
-          <w:tblCellMar>
-            <w:top w:w="0" w:type="dxa"/>
-            <w:bottom w:w="0" w:type="dxa"/>
-          </w:tblCellMar>
-        </w:tblPrEx>
         <w:tc>
           <w:tcPr>
             <w:tcW w:w="4513" w:type="dxa"/>
@@ -2483,12 +2326,6 @@
         </w:tc>
       </w:tr>
       <w:tr>
-        <w:tblPrEx>
-          <w:tblCellMar>
-            <w:top w:w="0" w:type="dxa"/>
-            <w:bottom w:w="0" w:type="dxa"/>
-          </w:tblCellMar>
-        </w:tblPrEx>
         <w:tc>
           <w:tcPr>
             <w:tcW w:w="4513" w:type="dxa"/>
@@ -2511,12 +2348,6 @@
         </w:tc>
       </w:tr>
       <w:tr>
-        <w:tblPrEx>
-          <w:tblCellMar>
-            <w:top w:w="0" w:type="dxa"/>
-            <w:bottom w:w="0" w:type="dxa"/>
-          </w:tblCellMar>
-        </w:tblPrEx>
         <w:tc>
           <w:tcPr>
             <w:tcW w:w="4513" w:type="dxa"/>
@@ -2539,12 +2370,6 @@
         </w:tc>
       </w:tr>
       <w:tr>
-        <w:tblPrEx>
-          <w:tblCellMar>
-            <w:top w:w="0" w:type="dxa"/>
-            <w:bottom w:w="0" w:type="dxa"/>
-          </w:tblCellMar>
-        </w:tblPrEx>
         <w:tc>
           <w:tcPr>
             <w:tcW w:w="4513" w:type="dxa"/>
@@ -2672,12 +2497,6 @@
         <w:gridCol w:w="4513"/>
       </w:tblGrid>
       <w:tr>
-        <w:tblPrEx>
-          <w:tblCellMar>
-            <w:top w:w="0" w:type="dxa"/>
-            <w:bottom w:w="0" w:type="dxa"/>
-          </w:tblCellMar>
-        </w:tblPrEx>
         <w:tc>
           <w:tcPr>
             <w:tcW w:w="4513" w:type="dxa"/>
@@ -2716,12 +2535,6 @@
         </w:tc>
       </w:tr>
       <w:tr>
-        <w:tblPrEx>
-          <w:tblCellMar>
-            <w:top w:w="0" w:type="dxa"/>
-            <w:bottom w:w="0" w:type="dxa"/>
-          </w:tblCellMar>
-        </w:tblPrEx>
         <w:tc>
           <w:tcPr>
             <w:tcW w:w="4513" w:type="dxa"/>
@@ -2744,12 +2557,6 @@
         </w:tc>
       </w:tr>
       <w:tr>
-        <w:tblPrEx>
-          <w:tblCellMar>
-            <w:top w:w="0" w:type="dxa"/>
-            <w:bottom w:w="0" w:type="dxa"/>
-          </w:tblCellMar>
-        </w:tblPrEx>
         <w:tc>
           <w:tcPr>
             <w:tcW w:w="4513" w:type="dxa"/>
@@ -2772,12 +2579,6 @@
         </w:tc>
       </w:tr>
       <w:tr>
-        <w:tblPrEx>
-          <w:tblCellMar>
-            <w:top w:w="0" w:type="dxa"/>
-            <w:bottom w:w="0" w:type="dxa"/>
-          </w:tblCellMar>
-        </w:tblPrEx>
         <w:tc>
           <w:tcPr>
             <w:tcW w:w="4513" w:type="dxa"/>
@@ -2800,12 +2601,6 @@
         </w:tc>
       </w:tr>
       <w:tr>
-        <w:tblPrEx>
-          <w:tblCellMar>
-            <w:top w:w="0" w:type="dxa"/>
-            <w:bottom w:w="0" w:type="dxa"/>
-          </w:tblCellMar>
-        </w:tblPrEx>
         <w:tc>
           <w:tcPr>
             <w:tcW w:w="4513" w:type="dxa"/>
@@ -2828,12 +2623,6 @@
         </w:tc>
       </w:tr>
       <w:tr>
-        <w:tblPrEx>
-          <w:tblCellMar>
-            <w:top w:w="0" w:type="dxa"/>
-            <w:bottom w:w="0" w:type="dxa"/>
-          </w:tblCellMar>
-        </w:tblPrEx>
         <w:tc>
           <w:tcPr>
             <w:tcW w:w="4513" w:type="dxa"/>
@@ -2894,12 +2683,6 @@
         <w:gridCol w:w="4513"/>
       </w:tblGrid>
       <w:tr>
-        <w:tblPrEx>
-          <w:tblCellMar>
-            <w:top w:w="0" w:type="dxa"/>
-            <w:bottom w:w="0" w:type="dxa"/>
-          </w:tblCellMar>
-        </w:tblPrEx>
         <w:tc>
           <w:tcPr>
             <w:tcW w:w="4513" w:type="dxa"/>
@@ -2938,12 +2721,6 @@
         </w:tc>
       </w:tr>
       <w:tr>
-        <w:tblPrEx>
-          <w:tblCellMar>
-            <w:top w:w="0" w:type="dxa"/>
-            <w:bottom w:w="0" w:type="dxa"/>
-          </w:tblCellMar>
-        </w:tblPrEx>
         <w:tc>
           <w:tcPr>
             <w:tcW w:w="4513" w:type="dxa"/>
@@ -2966,12 +2743,6 @@
         </w:tc>
       </w:tr>
       <w:tr>
-        <w:tblPrEx>
-          <w:tblCellMar>
-            <w:top w:w="0" w:type="dxa"/>
-            <w:bottom w:w="0" w:type="dxa"/>
-          </w:tblCellMar>
-        </w:tblPrEx>
         <w:tc>
           <w:tcPr>
             <w:tcW w:w="4513" w:type="dxa"/>
@@ -2994,12 +2765,6 @@
         </w:tc>
       </w:tr>
       <w:tr>
-        <w:tblPrEx>
-          <w:tblCellMar>
-            <w:top w:w="0" w:type="dxa"/>
-            <w:bottom w:w="0" w:type="dxa"/>
-          </w:tblCellMar>
-        </w:tblPrEx>
         <w:tc>
           <w:tcPr>
             <w:tcW w:w="4513" w:type="dxa"/>
@@ -3022,12 +2787,6 @@
         </w:tc>
       </w:tr>
       <w:tr>
-        <w:tblPrEx>
-          <w:tblCellMar>
-            <w:top w:w="0" w:type="dxa"/>
-            <w:bottom w:w="0" w:type="dxa"/>
-          </w:tblCellMar>
-        </w:tblPrEx>
         <w:tc>
           <w:tcPr>
             <w:tcW w:w="4513" w:type="dxa"/>
@@ -3050,12 +2809,6 @@
         </w:tc>
       </w:tr>
       <w:tr>
-        <w:tblPrEx>
-          <w:tblCellMar>
-            <w:top w:w="0" w:type="dxa"/>
-            <w:bottom w:w="0" w:type="dxa"/>
-          </w:tblCellMar>
-        </w:tblPrEx>
         <w:tc>
           <w:tcPr>
             <w:tcW w:w="4513" w:type="dxa"/>
@@ -3134,7 +2887,15 @@
     </w:p>
     <w:p>
       <w:r>
-        <w:t>The Employees list shows all staff with Name, Employee ID, Email, Role, Department, and Active status. Use the search bar to find employees by name or ID; role badges are colour-coded.</w:t>
+        <w:t xml:space="preserve">The Employees list shows all staff with Name, Employee ID, Email, Role, Department, and Active status. Use the search bar to find employees by name or ID; role badges are </w:t>
+      </w:r>
+      <w:proofErr w:type="gramStart"/>
+      <w:r>
+        <w:t>colour-coded</w:t>
+      </w:r>
+      <w:proofErr w:type="gramEnd"/>
+      <w:r>
+        <w:t>.</w:t>
       </w:r>
     </w:p>
     <w:p>
@@ -3147,12 +2908,28 @@
     </w:p>
     <w:p>
       <w:r>
-        <w:t>Click New Employee and fill in: First Name, Last Name, Employee ID (unique, e.g., EMP001), Email Address (used for login), Role, Department (optional), Designation (optional), Phone Number (optional), Timezone (optional), Join Date (optional), and Active.</w:t>
-      </w:r>
-    </w:p>
-    <w:p>
-      <w:r>
-        <w:t>Click Save. The employee receives a temporary password by email (if configured) or you can share it manually. They must change it on first login.</w:t>
+        <w:t xml:space="preserve">Click New Employee and fill in: First Name, Last Name, Employee ID (unique, e.g., EMP001), Email Address (used for login), Role, Department (optional), Designation (optional), Phone Number (optional), </w:t>
+      </w:r>
+      <w:proofErr w:type="spellStart"/>
+      <w:r>
+        <w:t>Timezone</w:t>
+      </w:r>
+      <w:proofErr w:type="spellEnd"/>
+      <w:r>
+        <w:t xml:space="preserve"> (optional), Join Date (optional), and Active.</w:t>
+      </w:r>
+    </w:p>
+    <w:p>
+      <w:r>
+        <w:t>Click Save. The employee receives a temporary password by email (if configured</w:t>
+      </w:r>
+      <w:proofErr w:type="gramStart"/>
+      <w:r>
+        <w:t>)</w:t>
+      </w:r>
+      <w:proofErr w:type="gramEnd"/>
+      <w:r>
+        <w:t xml:space="preserve"> or you can share it manually. They must change it on first login.</w:t>
       </w:r>
     </w:p>
     <w:p>
@@ -3189,7 +2966,15 @@
     </w:p>
     <w:p>
       <w:r>
-        <w:t>Click an employee's name to open their detail page, then Edit to modify any field. Uncheck Active to deactivate an employee (they will no longer be able to log in).</w:t>
+        <w:t xml:space="preserve">Click an employee's name to open their detail page, then </w:t>
+      </w:r>
+      <w:proofErr w:type="gramStart"/>
+      <w:r>
+        <w:t>Edit</w:t>
+      </w:r>
+      <w:proofErr w:type="gramEnd"/>
+      <w:r>
+        <w:t xml:space="preserve"> to modify any field. Uncheck Active to deactivate an employee (they will no longer be able to log in).</w:t>
       </w:r>
     </w:p>
     <w:p>
@@ -3202,7 +2987,23 @@
     </w:p>
     <w:p>
       <w:r>
-        <w:t>As an HR Admin, the Timesheet History page shows timesheets for ALL employees. An Employee dropdown filter and Employee column let you select and identify any employee. Filter by Status tabs, and click a row to open a read-only view.</w:t>
+        <w:t xml:space="preserve">As an HR Admin, the Timesheet History page shows timesheets for ALL employees. An </w:t>
+      </w:r>
+      <w:proofErr w:type="gramStart"/>
+      <w:r>
+        <w:t>Employee</w:t>
+      </w:r>
+      <w:proofErr w:type="gramEnd"/>
+      <w:r>
+        <w:t xml:space="preserve"> dropdown filter and Employee column let you select and identify any employee. Filter by Status </w:t>
+      </w:r>
+      <w:proofErr w:type="gramStart"/>
+      <w:r>
+        <w:t>tabs, and</w:t>
+      </w:r>
+      <w:proofErr w:type="gramEnd"/>
+      <w:r>
+        <w:t xml:space="preserve"> click a row to open a read-only view.</w:t>
       </w:r>
     </w:p>
     <w:p>
@@ -3318,7 +3119,15 @@
     </w:p>
     <w:p>
       <w:r>
-        <w:t>Update Organisation Name, Timezone, Date Format, Week Start Day. Configure Working Hours Per Day, Working Days Per Week, Timesheet Period (Weekly/Bi-Weekly/Monthly). Set Overtime Threshold and Support Email.</w:t>
+        <w:t xml:space="preserve">Update Organisation Name, </w:t>
+      </w:r>
+      <w:proofErr w:type="spellStart"/>
+      <w:r>
+        <w:t>Timezone</w:t>
+      </w:r>
+      <w:proofErr w:type="spellEnd"/>
+      <w:r>
+        <w:t>, Date Format, Week Start Day. Configure Working Hours Per Day, Working Days Per Week, Timesheet Period (Weekly/Bi-Weekly/Monthly). Set Overtime Threshold and Support Email.</w:t>
       </w:r>
     </w:p>
     <w:p>
@@ -3419,12 +3228,6 @@
         <w:gridCol w:w="4513"/>
       </w:tblGrid>
       <w:tr>
-        <w:tblPrEx>
-          <w:tblCellMar>
-            <w:top w:w="0" w:type="dxa"/>
-            <w:bottom w:w="0" w:type="dxa"/>
-          </w:tblCellMar>
-        </w:tblPrEx>
         <w:tc>
           <w:tcPr>
             <w:tcW w:w="4513" w:type="dxa"/>
@@ -3463,12 +3266,6 @@
         </w:tc>
       </w:tr>
       <w:tr>
-        <w:tblPrEx>
-          <w:tblCellMar>
-            <w:top w:w="0" w:type="dxa"/>
-            <w:bottom w:w="0" w:type="dxa"/>
-          </w:tblCellMar>
-        </w:tblPrEx>
         <w:tc>
           <w:tcPr>
             <w:tcW w:w="4513" w:type="dxa"/>
@@ -3491,12 +3288,6 @@
         </w:tc>
       </w:tr>
       <w:tr>
-        <w:tblPrEx>
-          <w:tblCellMar>
-            <w:top w:w="0" w:type="dxa"/>
-            <w:bottom w:w="0" w:type="dxa"/>
-          </w:tblCellMar>
-        </w:tblPrEx>
         <w:tc>
           <w:tcPr>
             <w:tcW w:w="4513" w:type="dxa"/>
@@ -3519,12 +3310,6 @@
         </w:tc>
       </w:tr>
       <w:tr>
-        <w:tblPrEx>
-          <w:tblCellMar>
-            <w:top w:w="0" w:type="dxa"/>
-            <w:bottom w:w="0" w:type="dxa"/>
-          </w:tblCellMar>
-        </w:tblPrEx>
         <w:tc>
           <w:tcPr>
             <w:tcW w:w="4513" w:type="dxa"/>
@@ -3547,12 +3332,6 @@
         </w:tc>
       </w:tr>
       <w:tr>
-        <w:tblPrEx>
-          <w:tblCellMar>
-            <w:top w:w="0" w:type="dxa"/>
-            <w:bottom w:w="0" w:type="dxa"/>
-          </w:tblCellMar>
-        </w:tblPrEx>
         <w:tc>
           <w:tcPr>
             <w:tcW w:w="4513" w:type="dxa"/>
@@ -3575,12 +3354,6 @@
         </w:tc>
       </w:tr>
       <w:tr>
-        <w:tblPrEx>
-          <w:tblCellMar>
-            <w:top w:w="0" w:type="dxa"/>
-            <w:bottom w:w="0" w:type="dxa"/>
-          </w:tblCellMar>
-        </w:tblPrEx>
         <w:tc>
           <w:tcPr>
             <w:tcW w:w="4513" w:type="dxa"/>
@@ -3603,12 +3376,6 @@
         </w:tc>
       </w:tr>
       <w:tr>
-        <w:tblPrEx>
-          <w:tblCellMar>
-            <w:top w:w="0" w:type="dxa"/>
-            <w:bottom w:w="0" w:type="dxa"/>
-          </w:tblCellMar>
-        </w:tblPrEx>
         <w:tc>
           <w:tcPr>
             <w:tcW w:w="4513" w:type="dxa"/>
@@ -3631,12 +3398,6 @@
         </w:tc>
       </w:tr>
       <w:tr>
-        <w:tblPrEx>
-          <w:tblCellMar>
-            <w:top w:w="0" w:type="dxa"/>
-            <w:bottom w:w="0" w:type="dxa"/>
-          </w:tblCellMar>
-        </w:tblPrEx>
         <w:tc>
           <w:tcPr>
             <w:tcW w:w="4513" w:type="dxa"/>
@@ -3659,12 +3420,6 @@
         </w:tc>
       </w:tr>
       <w:tr>
-        <w:tblPrEx>
-          <w:tblCellMar>
-            <w:top w:w="0" w:type="dxa"/>
-            <w:bottom w:w="0" w:type="dxa"/>
-          </w:tblCellMar>
-        </w:tblPrEx>
         <w:tc>
           <w:tcPr>
             <w:tcW w:w="4513" w:type="dxa"/>
@@ -3716,7 +3471,15 @@
     </w:p>
     <w:p>
       <w:r>
-        <w:t>Click the Export tab, then Download Backup to generate and download a complete database backup file. Store it in a secure location off-server.</w:t>
+        <w:t xml:space="preserve">Click the Export tab, then Download Backup to generate and download a complete database backup file. Store it in a secure location </w:t>
+      </w:r>
+      <w:proofErr w:type="gramStart"/>
+      <w:r>
+        <w:t>off-server</w:t>
+      </w:r>
+      <w:proofErr w:type="gramEnd"/>
+      <w:r>
+        <w:t>.</w:t>
       </w:r>
     </w:p>
     <w:p>
@@ -3760,7 +3523,15 @@
     </w:p>
     <w:p>
       <w:r>
-        <w:t>Enter Endpoint URL, Bucket Name, Access Key, Secret Key, and Region, then Save Configuration. Backups upload automatically (AWS S3, MinIO, Wasabi, etc.).</w:t>
+        <w:t xml:space="preserve">Enter Endpoint URL, Bucket Name, Access Key, Secret Key, and Region, then Save Configuration. Backups upload automatically (AWS S3, </w:t>
+      </w:r>
+      <w:proofErr w:type="spellStart"/>
+      <w:r>
+        <w:t>MinIO</w:t>
+      </w:r>
+      <w:proofErr w:type="spellEnd"/>
+      <w:r>
+        <w:t>, Wasabi, etc.).</w:t>
       </w:r>
     </w:p>
     <w:p>
@@ -3935,12 +3706,6 @@
         <w:gridCol w:w="3009"/>
       </w:tblGrid>
       <w:tr>
-        <w:tblPrEx>
-          <w:tblCellMar>
-            <w:top w:w="0" w:type="dxa"/>
-            <w:bottom w:w="0" w:type="dxa"/>
-          </w:tblCellMar>
-        </w:tblPrEx>
         <w:tc>
           <w:tcPr>
             <w:tcW w:w="3008" w:type="dxa"/>
@@ -3997,12 +3762,6 @@
         </w:tc>
       </w:tr>
       <w:tr>
-        <w:tblPrEx>
-          <w:tblCellMar>
-            <w:top w:w="0" w:type="dxa"/>
-            <w:bottom w:w="0" w:type="dxa"/>
-          </w:tblCellMar>
-        </w:tblPrEx>
         <w:tc>
           <w:tcPr>
             <w:tcW w:w="3008" w:type="dxa"/>
@@ -4035,12 +3794,6 @@
         </w:tc>
       </w:tr>
       <w:tr>
-        <w:tblPrEx>
-          <w:tblCellMar>
-            <w:top w:w="0" w:type="dxa"/>
-            <w:bottom w:w="0" w:type="dxa"/>
-          </w:tblCellMar>
-        </w:tblPrEx>
         <w:tc>
           <w:tcPr>
             <w:tcW w:w="3008" w:type="dxa"/>
@@ -4073,12 +3826,6 @@
         </w:tc>
       </w:tr>
       <w:tr>
-        <w:tblPrEx>
-          <w:tblCellMar>
-            <w:top w:w="0" w:type="dxa"/>
-            <w:bottom w:w="0" w:type="dxa"/>
-          </w:tblCellMar>
-        </w:tblPrEx>
         <w:tc>
           <w:tcPr>
             <w:tcW w:w="3008" w:type="dxa"/>
@@ -4112,12 +3859,6 @@
         </w:tc>
       </w:tr>
       <w:tr>
-        <w:tblPrEx>
-          <w:tblCellMar>
-            <w:top w:w="0" w:type="dxa"/>
-            <w:bottom w:w="0" w:type="dxa"/>
-          </w:tblCellMar>
-        </w:tblPrEx>
         <w:tc>
           <w:tcPr>
             <w:tcW w:w="3008" w:type="dxa"/>
@@ -4150,12 +3891,6 @@
         </w:tc>
       </w:tr>
       <w:tr>
-        <w:tblPrEx>
-          <w:tblCellMar>
-            <w:top w:w="0" w:type="dxa"/>
-            <w:bottom w:w="0" w:type="dxa"/>
-          </w:tblCellMar>
-        </w:tblPrEx>
         <w:tc>
           <w:tcPr>
             <w:tcW w:w="3008" w:type="dxa"/>
@@ -4188,12 +3923,6 @@
         </w:tc>
       </w:tr>
       <w:tr>
-        <w:tblPrEx>
-          <w:tblCellMar>
-            <w:top w:w="0" w:type="dxa"/>
-            <w:bottom w:w="0" w:type="dxa"/>
-          </w:tblCellMar>
-        </w:tblPrEx>
         <w:tc>
           <w:tcPr>
             <w:tcW w:w="3008" w:type="dxa"/>
@@ -4255,12 +3984,6 @@
         <w:gridCol w:w="3009"/>
       </w:tblGrid>
       <w:tr>
-        <w:tblPrEx>
-          <w:tblCellMar>
-            <w:top w:w="0" w:type="dxa"/>
-            <w:bottom w:w="0" w:type="dxa"/>
-          </w:tblCellMar>
-        </w:tblPrEx>
         <w:tc>
           <w:tcPr>
             <w:tcW w:w="3008" w:type="dxa"/>
@@ -4317,12 +4040,6 @@
         </w:tc>
       </w:tr>
       <w:tr>
-        <w:tblPrEx>
-          <w:tblCellMar>
-            <w:top w:w="0" w:type="dxa"/>
-            <w:bottom w:w="0" w:type="dxa"/>
-          </w:tblCellMar>
-        </w:tblPrEx>
         <w:tc>
           <w:tcPr>
             <w:tcW w:w="3008" w:type="dxa"/>
@@ -4355,12 +4072,6 @@
         </w:tc>
       </w:tr>
       <w:tr>
-        <w:tblPrEx>
-          <w:tblCellMar>
-            <w:top w:w="0" w:type="dxa"/>
-            <w:bottom w:w="0" w:type="dxa"/>
-          </w:tblCellMar>
-        </w:tblPrEx>
         <w:tc>
           <w:tcPr>
             <w:tcW w:w="3008" w:type="dxa"/>
@@ -4393,12 +4104,6 @@
         </w:tc>
       </w:tr>
       <w:tr>
-        <w:tblPrEx>
-          <w:tblCellMar>
-            <w:top w:w="0" w:type="dxa"/>
-            <w:bottom w:w="0" w:type="dxa"/>
-          </w:tblCellMar>
-        </w:tblPrEx>
         <w:tc>
           <w:tcPr>
             <w:tcW w:w="3008" w:type="dxa"/>
@@ -4431,12 +4136,6 @@
         </w:tc>
       </w:tr>
       <w:tr>
-        <w:tblPrEx>
-          <w:tblCellMar>
-            <w:top w:w="0" w:type="dxa"/>
-            <w:bottom w:w="0" w:type="dxa"/>
-          </w:tblCellMar>
-        </w:tblPrEx>
         <w:tc>
           <w:tcPr>
             <w:tcW w:w="3008" w:type="dxa"/>
@@ -4469,12 +4168,6 @@
         </w:tc>
       </w:tr>
       <w:tr>
-        <w:tblPrEx>
-          <w:tblCellMar>
-            <w:top w:w="0" w:type="dxa"/>
-            <w:bottom w:w="0" w:type="dxa"/>
-          </w:tblCellMar>
-        </w:tblPrEx>
         <w:tc>
           <w:tcPr>
             <w:tcW w:w="3008" w:type="dxa"/>
@@ -4507,12 +4200,6 @@
         </w:tc>
       </w:tr>
       <w:tr>
-        <w:tblPrEx>
-          <w:tblCellMar>
-            <w:top w:w="0" w:type="dxa"/>
-            <w:bottom w:w="0" w:type="dxa"/>
-          </w:tblCellMar>
-        </w:tblPrEx>
         <w:tc>
           <w:tcPr>
             <w:tcW w:w="3008" w:type="dxa"/>
@@ -4574,12 +4261,6 @@
         <w:gridCol w:w="3009"/>
       </w:tblGrid>
       <w:tr>
-        <w:tblPrEx>
-          <w:tblCellMar>
-            <w:top w:w="0" w:type="dxa"/>
-            <w:bottom w:w="0" w:type="dxa"/>
-          </w:tblCellMar>
-        </w:tblPrEx>
         <w:tc>
           <w:tcPr>
             <w:tcW w:w="3008" w:type="dxa"/>
@@ -4636,12 +4317,6 @@
         </w:tc>
       </w:tr>
       <w:tr>
-        <w:tblPrEx>
-          <w:tblCellMar>
-            <w:top w:w="0" w:type="dxa"/>
-            <w:bottom w:w="0" w:type="dxa"/>
-          </w:tblCellMar>
-        </w:tblPrEx>
         <w:tc>
           <w:tcPr>
             <w:tcW w:w="3008" w:type="dxa"/>
@@ -4674,12 +4349,6 @@
         </w:tc>
       </w:tr>
       <w:tr>
-        <w:tblPrEx>
-          <w:tblCellMar>
-            <w:top w:w="0" w:type="dxa"/>
-            <w:bottom w:w="0" w:type="dxa"/>
-          </w:tblCellMar>
-        </w:tblPrEx>
         <w:tc>
           <w:tcPr>
             <w:tcW w:w="3008" w:type="dxa"/>
@@ -4712,12 +4381,6 @@
         </w:tc>
       </w:tr>
       <w:tr>
-        <w:tblPrEx>
-          <w:tblCellMar>
-            <w:top w:w="0" w:type="dxa"/>
-            <w:bottom w:w="0" w:type="dxa"/>
-          </w:tblCellMar>
-        </w:tblPrEx>
         <w:tc>
           <w:tcPr>
             <w:tcW w:w="3008" w:type="dxa"/>
@@ -4751,12 +4414,6 @@
         </w:tc>
       </w:tr>
       <w:tr>
-        <w:tblPrEx>
-          <w:tblCellMar>
-            <w:top w:w="0" w:type="dxa"/>
-            <w:bottom w:w="0" w:type="dxa"/>
-          </w:tblCellMar>
-        </w:tblPrEx>
         <w:tc>
           <w:tcPr>
             <w:tcW w:w="3008" w:type="dxa"/>
@@ -4789,12 +4446,6 @@
         </w:tc>
       </w:tr>
       <w:tr>
-        <w:tblPrEx>
-          <w:tblCellMar>
-            <w:top w:w="0" w:type="dxa"/>
-            <w:bottom w:w="0" w:type="dxa"/>
-          </w:tblCellMar>
-        </w:tblPrEx>
         <w:tc>
           <w:tcPr>
             <w:tcW w:w="3008" w:type="dxa"/>
@@ -4827,12 +4478,6 @@
         </w:tc>
       </w:tr>
       <w:tr>
-        <w:tblPrEx>
-          <w:tblCellMar>
-            <w:top w:w="0" w:type="dxa"/>
-            <w:bottom w:w="0" w:type="dxa"/>
-          </w:tblCellMar>
-        </w:tblPrEx>
         <w:tc>
           <w:tcPr>
             <w:tcW w:w="3008" w:type="dxa"/>
@@ -4894,12 +4539,6 @@
         <w:gridCol w:w="3009"/>
       </w:tblGrid>
       <w:tr>
-        <w:tblPrEx>
-          <w:tblCellMar>
-            <w:top w:w="0" w:type="dxa"/>
-            <w:bottom w:w="0" w:type="dxa"/>
-          </w:tblCellMar>
-        </w:tblPrEx>
         <w:tc>
           <w:tcPr>
             <w:tcW w:w="3008" w:type="dxa"/>
@@ -4956,12 +4595,6 @@
         </w:tc>
       </w:tr>
       <w:tr>
-        <w:tblPrEx>
-          <w:tblCellMar>
-            <w:top w:w="0" w:type="dxa"/>
-            <w:bottom w:w="0" w:type="dxa"/>
-          </w:tblCellMar>
-        </w:tblPrEx>
         <w:tc>
           <w:tcPr>
             <w:tcW w:w="3008" w:type="dxa"/>
@@ -4994,12 +4627,6 @@
         </w:tc>
       </w:tr>
       <w:tr>
-        <w:tblPrEx>
-          <w:tblCellMar>
-            <w:top w:w="0" w:type="dxa"/>
-            <w:bottom w:w="0" w:type="dxa"/>
-          </w:tblCellMar>
-        </w:tblPrEx>
         <w:tc>
           <w:tcPr>
             <w:tcW w:w="3008" w:type="dxa"/>
@@ -5032,12 +4659,6 @@
         </w:tc>
       </w:tr>
       <w:tr>
-        <w:tblPrEx>
-          <w:tblCellMar>
-            <w:top w:w="0" w:type="dxa"/>
-            <w:bottom w:w="0" w:type="dxa"/>
-          </w:tblCellMar>
-        </w:tblPrEx>
         <w:tc>
           <w:tcPr>
             <w:tcW w:w="3008" w:type="dxa"/>
@@ -5070,12 +4691,6 @@
         </w:tc>
       </w:tr>
       <w:tr>
-        <w:tblPrEx>
-          <w:tblCellMar>
-            <w:top w:w="0" w:type="dxa"/>
-            <w:bottom w:w="0" w:type="dxa"/>
-          </w:tblCellMar>
-        </w:tblPrEx>
         <w:tc>
           <w:tcPr>
             <w:tcW w:w="3008" w:type="dxa"/>
@@ -5108,12 +4723,6 @@
         </w:tc>
       </w:tr>
       <w:tr>
-        <w:tblPrEx>
-          <w:tblCellMar>
-            <w:top w:w="0" w:type="dxa"/>
-            <w:bottom w:w="0" w:type="dxa"/>
-          </w:tblCellMar>
-        </w:tblPrEx>
         <w:tc>
           <w:tcPr>
             <w:tcW w:w="3008" w:type="dxa"/>
@@ -5223,12 +4832,6 @@
         <w:gridCol w:w="3009"/>
       </w:tblGrid>
       <w:tr>
-        <w:tblPrEx>
-          <w:tblCellMar>
-            <w:top w:w="0" w:type="dxa"/>
-            <w:bottom w:w="0" w:type="dxa"/>
-          </w:tblCellMar>
-        </w:tblPrEx>
         <w:tc>
           <w:tcPr>
             <w:tcW w:w="3008" w:type="dxa"/>
@@ -5285,12 +4888,6 @@
         </w:tc>
       </w:tr>
       <w:tr>
-        <w:tblPrEx>
-          <w:tblCellMar>
-            <w:top w:w="0" w:type="dxa"/>
-            <w:bottom w:w="0" w:type="dxa"/>
-          </w:tblCellMar>
-        </w:tblPrEx>
         <w:tc>
           <w:tcPr>
             <w:tcW w:w="3008" w:type="dxa"/>
@@ -5327,12 +4924,6 @@
         </w:tc>
       </w:tr>
       <w:tr>
-        <w:tblPrEx>
-          <w:tblCellMar>
-            <w:top w:w="0" w:type="dxa"/>
-            <w:bottom w:w="0" w:type="dxa"/>
-          </w:tblCellMar>
-        </w:tblPrEx>
         <w:tc>
           <w:tcPr>
             <w:tcW w:w="3008" w:type="dxa"/>
@@ -5366,12 +4957,6 @@
         </w:tc>
       </w:tr>
       <w:tr>
-        <w:tblPrEx>
-          <w:tblCellMar>
-            <w:top w:w="0" w:type="dxa"/>
-            <w:bottom w:w="0" w:type="dxa"/>
-          </w:tblCellMar>
-        </w:tblPrEx>
         <w:tc>
           <w:tcPr>
             <w:tcW w:w="3008" w:type="dxa"/>
@@ -5404,12 +4989,6 @@
         </w:tc>
       </w:tr>
       <w:tr>
-        <w:tblPrEx>
-          <w:tblCellMar>
-            <w:top w:w="0" w:type="dxa"/>
-            <w:bottom w:w="0" w:type="dxa"/>
-          </w:tblCellMar>
-        </w:tblPrEx>
         <w:tc>
           <w:tcPr>
             <w:tcW w:w="3008" w:type="dxa"/>
@@ -5442,12 +5021,6 @@
         </w:tc>
       </w:tr>
       <w:tr>
-        <w:tblPrEx>
-          <w:tblCellMar>
-            <w:top w:w="0" w:type="dxa"/>
-            <w:bottom w:w="0" w:type="dxa"/>
-          </w:tblCellMar>
-        </w:tblPrEx>
         <w:tc>
           <w:tcPr>
             <w:tcW w:w="3008" w:type="dxa"/>
@@ -5480,12 +5053,6 @@
         </w:tc>
       </w:tr>
       <w:tr>
-        <w:tblPrEx>
-          <w:tblCellMar>
-            <w:top w:w="0" w:type="dxa"/>
-            <w:bottom w:w="0" w:type="dxa"/>
-          </w:tblCellMar>
-        </w:tblPrEx>
         <w:tc>
           <w:tcPr>
             <w:tcW w:w="3008" w:type="dxa"/>
@@ -5518,12 +5085,6 @@
         </w:tc>
       </w:tr>
       <w:tr>
-        <w:tblPrEx>
-          <w:tblCellMar>
-            <w:top w:w="0" w:type="dxa"/>
-            <w:bottom w:w="0" w:type="dxa"/>
-          </w:tblCellMar>
-        </w:tblPrEx>
         <w:tc>
           <w:tcPr>
             <w:tcW w:w="3008" w:type="dxa"/>
@@ -5556,12 +5117,6 @@
         </w:tc>
       </w:tr>
       <w:tr>
-        <w:tblPrEx>
-          <w:tblCellMar>
-            <w:top w:w="0" w:type="dxa"/>
-            <w:bottom w:w="0" w:type="dxa"/>
-          </w:tblCellMar>
-        </w:tblPrEx>
         <w:tc>
           <w:tcPr>
             <w:tcW w:w="3008" w:type="dxa"/>
@@ -5594,12 +5149,6 @@
         </w:tc>
       </w:tr>
       <w:tr>
-        <w:tblPrEx>
-          <w:tblCellMar>
-            <w:top w:w="0" w:type="dxa"/>
-            <w:bottom w:w="0" w:type="dxa"/>
-          </w:tblCellMar>
-        </w:tblPrEx>
         <w:tc>
           <w:tcPr>
             <w:tcW w:w="3008" w:type="dxa"/>
@@ -5632,12 +5181,6 @@
         </w:tc>
       </w:tr>
       <w:tr>
-        <w:tblPrEx>
-          <w:tblCellMar>
-            <w:top w:w="0" w:type="dxa"/>
-            <w:bottom w:w="0" w:type="dxa"/>
-          </w:tblCellMar>
-        </w:tblPrEx>
         <w:tc>
           <w:tcPr>
             <w:tcW w:w="3008" w:type="dxa"/>
@@ -5664,7 +5207,15 @@
           </w:tcPr>
           <w:p>
             <w:r>
-              <w:t>Press Ctrl+Shift+R (hard refresh) or clear browser cache.</w:t>
+              <w:t xml:space="preserve">Press </w:t>
+            </w:r>
+            <w:proofErr w:type="spellStart"/>
+            <w:r>
+              <w:t>Ctrl+Shift+R</w:t>
+            </w:r>
+            <w:proofErr w:type="spellEnd"/>
+            <w:r>
+              <w:t xml:space="preserve"> (hard refresh) or clear browser cache.</w:t>
             </w:r>
           </w:p>
         </w:tc>
@@ -5697,8 +5248,13 @@
       <w:pPr>
         <w:pStyle w:val="ListBullet"/>
       </w:pPr>
-      <w:r>
-        <w:t>Ctrl+Shift+R - Hard refresh the page (clears cache).</w:t>
+      <w:proofErr w:type="spellStart"/>
+      <w:r>
+        <w:t>Ctrl+Shift+R</w:t>
+      </w:r>
+      <w:proofErr w:type="spellEnd"/>
+      <w:r>
+        <w:t xml:space="preserve"> - Hard refresh the page (clears cache).</w:t>
       </w:r>
     </w:p>
     <w:p>
@@ -5706,7 +5262,15 @@
         <w:pStyle w:val="ListBullet"/>
       </w:pPr>
       <w:r>
-        <w:t>Use Tab to move between form fields and Enter to submit.</w:t>
+        <w:t xml:space="preserve">Use Tab to move between form fields and </w:t>
+      </w:r>
+      <w:proofErr w:type="gramStart"/>
+      <w:r>
+        <w:t>Enter</w:t>
+      </w:r>
+      <w:proofErr w:type="gramEnd"/>
+      <w:r>
+        <w:t xml:space="preserve"> to submit.</w:t>
       </w:r>
     </w:p>
     <w:p>
@@ -5727,7 +5291,7 @@
     </w:p>
     <w:tbl>
       <w:tblPr>
-        <w:tblW w:w="0" w:type="auto"/>
+        <w:tblW w:w="9026" w:type="dxa"/>
         <w:tblBorders>
           <w:top w:val="single" w:sz="4" w:space="0" w:color="auto"/>
           <w:left w:val="single" w:sz="4" w:space="0" w:color="auto"/>
@@ -5748,12 +5312,6 @@
         <w:gridCol w:w="1505"/>
       </w:tblGrid>
       <w:tr>
-        <w:tblPrEx>
-          <w:tblCellMar>
-            <w:top w:w="0" w:type="dxa"/>
-            <w:bottom w:w="0" w:type="dxa"/>
-          </w:tblCellMar>
-        </w:tblPrEx>
         <w:tc>
           <w:tcPr>
             <w:tcW w:w="1504" w:type="dxa"/>
@@ -5818,12 +5376,28 @@
                 <w:b/>
               </w:rPr>
             </w:pPr>
-            <w:r>
-              <w:rPr>
-                <w:b/>
-              </w:rPr>
-              <w:t>Proj/Dept Mgr</w:t>
-            </w:r>
+            <w:proofErr w:type="spellStart"/>
+            <w:r>
+              <w:rPr>
+                <w:b/>
+              </w:rPr>
+              <w:t>Proj</w:t>
+            </w:r>
+            <w:proofErr w:type="spellEnd"/>
+            <w:r>
+              <w:rPr>
+                <w:b/>
+              </w:rPr>
+              <w:t xml:space="preserve">/Dept </w:t>
+            </w:r>
+            <w:proofErr w:type="spellStart"/>
+            <w:r>
+              <w:rPr>
+                <w:b/>
+              </w:rPr>
+              <w:t>Mgr</w:t>
+            </w:r>
+            <w:proofErr w:type="spellEnd"/>
           </w:p>
         </w:tc>
         <w:tc>
@@ -5864,12 +5438,6 @@
         </w:tc>
       </w:tr>
       <w:tr>
-        <w:tblPrEx>
-          <w:tblCellMar>
-            <w:top w:w="0" w:type="dxa"/>
-            <w:bottom w:w="0" w:type="dxa"/>
-          </w:tblCellMar>
-        </w:tblPrEx>
         <w:tc>
           <w:tcPr>
             <w:tcW w:w="1504" w:type="dxa"/>
@@ -5932,12 +5500,6 @@
         </w:tc>
       </w:tr>
       <w:tr>
-        <w:tblPrEx>
-          <w:tblCellMar>
-            <w:top w:w="0" w:type="dxa"/>
-            <w:bottom w:w="0" w:type="dxa"/>
-          </w:tblCellMar>
-        </w:tblPrEx>
         <w:tc>
           <w:tcPr>
             <w:tcW w:w="1504" w:type="dxa"/>
@@ -6000,12 +5562,6 @@
         </w:tc>
       </w:tr>
       <w:tr>
-        <w:tblPrEx>
-          <w:tblCellMar>
-            <w:top w:w="0" w:type="dxa"/>
-            <w:bottom w:w="0" w:type="dxa"/>
-          </w:tblCellMar>
-        </w:tblPrEx>
         <w:tc>
           <w:tcPr>
             <w:tcW w:w="1504" w:type="dxa"/>
@@ -6068,12 +5624,6 @@
         </w:tc>
       </w:tr>
       <w:tr>
-        <w:tblPrEx>
-          <w:tblCellMar>
-            <w:top w:w="0" w:type="dxa"/>
-            <w:bottom w:w="0" w:type="dxa"/>
-          </w:tblCellMar>
-        </w:tblPrEx>
         <w:tc>
           <w:tcPr>
             <w:tcW w:w="1504" w:type="dxa"/>
@@ -6136,12 +5686,6 @@
         </w:tc>
       </w:tr>
       <w:tr>
-        <w:tblPrEx>
-          <w:tblCellMar>
-            <w:top w:w="0" w:type="dxa"/>
-            <w:bottom w:w="0" w:type="dxa"/>
-          </w:tblCellMar>
-        </w:tblPrEx>
         <w:tc>
           <w:tcPr>
             <w:tcW w:w="1504" w:type="dxa"/>
@@ -6204,12 +5748,6 @@
         </w:tc>
       </w:tr>
       <w:tr>
-        <w:tblPrEx>
-          <w:tblCellMar>
-            <w:top w:w="0" w:type="dxa"/>
-            <w:bottom w:w="0" w:type="dxa"/>
-          </w:tblCellMar>
-        </w:tblPrEx>
         <w:tc>
           <w:tcPr>
             <w:tcW w:w="1504" w:type="dxa"/>
@@ -6272,12 +5810,6 @@
         </w:tc>
       </w:tr>
       <w:tr>
-        <w:tblPrEx>
-          <w:tblCellMar>
-            <w:top w:w="0" w:type="dxa"/>
-            <w:bottom w:w="0" w:type="dxa"/>
-          </w:tblCellMar>
-        </w:tblPrEx>
         <w:tc>
           <w:tcPr>
             <w:tcW w:w="1504" w:type="dxa"/>
@@ -6340,12 +5872,6 @@
         </w:tc>
       </w:tr>
       <w:tr>
-        <w:tblPrEx>
-          <w:tblCellMar>
-            <w:top w:w="0" w:type="dxa"/>
-            <w:bottom w:w="0" w:type="dxa"/>
-          </w:tblCellMar>
-        </w:tblPrEx>
         <w:tc>
           <w:tcPr>
             <w:tcW w:w="1504" w:type="dxa"/>
@@ -6408,12 +5934,6 @@
         </w:tc>
       </w:tr>
       <w:tr>
-        <w:tblPrEx>
-          <w:tblCellMar>
-            <w:top w:w="0" w:type="dxa"/>
-            <w:bottom w:w="0" w:type="dxa"/>
-          </w:tblCellMar>
-        </w:tblPrEx>
         <w:tc>
           <w:tcPr>
             <w:tcW w:w="1504" w:type="dxa"/>
@@ -6476,12 +5996,6 @@
         </w:tc>
       </w:tr>
       <w:tr>
-        <w:tblPrEx>
-          <w:tblCellMar>
-            <w:top w:w="0" w:type="dxa"/>
-            <w:bottom w:w="0" w:type="dxa"/>
-          </w:tblCellMar>
-        </w:tblPrEx>
         <w:tc>
           <w:tcPr>
             <w:tcW w:w="1504" w:type="dxa"/>
@@ -6545,12 +6059,6 @@
         </w:tc>
       </w:tr>
       <w:tr>
-        <w:tblPrEx>
-          <w:tblCellMar>
-            <w:top w:w="0" w:type="dxa"/>
-            <w:bottom w:w="0" w:type="dxa"/>
-          </w:tblCellMar>
-        </w:tblPrEx>
         <w:tc>
           <w:tcPr>
             <w:tcW w:w="1504" w:type="dxa"/>
@@ -6613,12 +6121,6 @@
         </w:tc>
       </w:tr>
       <w:tr>
-        <w:tblPrEx>
-          <w:tblCellMar>
-            <w:top w:w="0" w:type="dxa"/>
-            <w:bottom w:w="0" w:type="dxa"/>
-          </w:tblCellMar>
-        </w:tblPrEx>
         <w:tc>
           <w:tcPr>
             <w:tcW w:w="1504" w:type="dxa"/>
@@ -6681,12 +6183,6 @@
         </w:tc>
       </w:tr>
       <w:tr>
-        <w:tblPrEx>
-          <w:tblCellMar>
-            <w:top w:w="0" w:type="dxa"/>
-            <w:bottom w:w="0" w:type="dxa"/>
-          </w:tblCellMar>
-        </w:tblPrEx>
         <w:tc>
           <w:tcPr>
             <w:tcW w:w="1504" w:type="dxa"/>
@@ -6749,12 +6245,6 @@
         </w:tc>
       </w:tr>
       <w:tr>
-        <w:tblPrEx>
-          <w:tblCellMar>
-            <w:top w:w="0" w:type="dxa"/>
-            <w:bottom w:w="0" w:type="dxa"/>
-          </w:tblCellMar>
-        </w:tblPrEx>
         <w:tc>
           <w:tcPr>
             <w:tcW w:w="1504" w:type="dxa"/>
@@ -6817,12 +6307,44 @@
         </w:tc>
       </w:tr>
       <w:tr>
-        <w:tblPrEx>
-          <w:tblCellMar>
-            <w:top w:w="0" w:type="dxa"/>
-            <w:bottom w:w="0" w:type="dxa"/>
-          </w:tblCellMar>
-        </w:tblPrEx>
+        <w:tc>
+          <w:tcPr>
+            <w:tcW w:w="1504" w:type="dxa"/>
+          </w:tcPr>
+          <w:p/>
+        </w:tc>
+        <w:tc>
+          <w:tcPr>
+            <w:tcW w:w="1504" w:type="dxa"/>
+          </w:tcPr>
+          <w:p/>
+        </w:tc>
+        <w:tc>
+          <w:tcPr>
+            <w:tcW w:w="1504" w:type="dxa"/>
+          </w:tcPr>
+          <w:p/>
+        </w:tc>
+        <w:tc>
+          <w:tcPr>
+            <w:tcW w:w="1504" w:type="dxa"/>
+          </w:tcPr>
+          <w:p/>
+        </w:tc>
+        <w:tc>
+          <w:tcPr>
+            <w:tcW w:w="1505" w:type="dxa"/>
+          </w:tcPr>
+          <w:p/>
+        </w:tc>
+        <w:tc>
+          <w:tcPr>
+            <w:tcW w:w="1505" w:type="dxa"/>
+          </w:tcPr>
+          <w:p/>
+        </w:tc>
+      </w:tr>
+      <w:tr>
         <w:tc>
           <w:tcPr>
             <w:tcW w:w="1504" w:type="dxa"/>
@@ -6885,12 +6407,6 @@
         </w:tc>
       </w:tr>
       <w:tr>
-        <w:tblPrEx>
-          <w:tblCellMar>
-            <w:top w:w="0" w:type="dxa"/>
-            <w:bottom w:w="0" w:type="dxa"/>
-          </w:tblCellMar>
-        </w:tblPrEx>
         <w:tc>
           <w:tcPr>
             <w:tcW w:w="1504" w:type="dxa"/>
@@ -6953,12 +6469,6 @@
         </w:tc>
       </w:tr>
       <w:tr>
-        <w:tblPrEx>
-          <w:tblCellMar>
-            <w:top w:w="0" w:type="dxa"/>
-            <w:bottom w:w="0" w:type="dxa"/>
-          </w:tblCellMar>
-        </w:tblPrEx>
         <w:tc>
           <w:tcPr>
             <w:tcW w:w="1504" w:type="dxa"/>
@@ -7021,12 +6531,6 @@
         </w:tc>
       </w:tr>
       <w:tr>
-        <w:tblPrEx>
-          <w:tblCellMar>
-            <w:top w:w="0" w:type="dxa"/>
-            <w:bottom w:w="0" w:type="dxa"/>
-          </w:tblCellMar>
-        </w:tblPrEx>
         <w:tc>
           <w:tcPr>
             <w:tcW w:w="1504" w:type="dxa"/>
@@ -7089,12 +6593,6 @@
         </w:tc>
       </w:tr>
       <w:tr>
-        <w:tblPrEx>
-          <w:tblCellMar>
-            <w:top w:w="0" w:type="dxa"/>
-            <w:bottom w:w="0" w:type="dxa"/>
-          </w:tblCellMar>
-        </w:tblPrEx>
         <w:tc>
           <w:tcPr>
             <w:tcW w:w="1504" w:type="dxa"/>

</xml_diff>